<commit_message>
Restore photo-first homepage and neutral resume copy
</commit_message>
<xml_diff>
--- a/resume/Zhenyu-Li-Senior-Product-Engineer-Bilingual-Resume.docx
+++ b/resume/Zhenyu-Li-Senior-Product-Engineer-Bilingual-Resume.docx
@@ -10,18 +10,19 @@
         <w:tblLook w:firstColumn="1" w:firstRow="1" w:lastColumn="0" w:lastRow="0" w:noHBand="0" w:noVBand="1" w:val="04A0"/>
       </w:tblPr>
       <w:tblGrid>
-        <w:gridCol w:w="10375"/>
+        <w:gridCol w:w="8249"/>
+        <w:gridCol w:w="2126"/>
       </w:tblGrid>
       <w:tr>
         <w:tc>
           <w:tcPr>
-            <w:tcW w:type="dxa" w:w="10375"/>
+            <w:tcW w:type="dxa" w:w="8249"/>
             <w:shd w:fill="10131A"/>
             <w:tcMar>
-              <w:top w:w="170" w:type="dxa"/>
-              <w:start w:w="230" w:type="dxa"/>
-              <w:bottom w:w="155" w:type="dxa"/>
-              <w:end w:w="230" w:type="dxa"/>
+              <w:top w:w="145" w:type="dxa"/>
+              <w:start w:w="220" w:type="dxa"/>
+              <w:bottom w:w="135" w:type="dxa"/>
+              <w:end w:w="170" w:type="dxa"/>
             </w:tcMar>
             <w:tcBorders>
               <w:bottom w:val="single" w:sz="16" w:color="30E6C8"/>
@@ -33,6 +34,22 @@
           <w:p>
             <w:pPr>
               <w:keepNext w:val="0"/>
+              <w:spacing w:before="0" w:after="40" w:line="240" w:lineRule="auto"/>
+            </w:pPr>
+            <w:r>
+              <w:rPr>
+                <w:rFonts w:ascii="Aptos" w:hAnsi="Aptos" w:eastAsia="Microsoft YaHei"/>
+                <w:b/>
+                <w:caps/>
+                <w:color w:val="30E6C8"/>
+                <w:sz w:val="12"/>
+              </w:rPr>
+              <w:t>SELECTED PROFILE  /  PRODUCT · ENGINEERING · EXPERIENCE</w:t>
+            </w:r>
+          </w:p>
+          <w:p>
+            <w:pPr>
+              <w:keepNext w:val="0"/>
               <w:spacing w:before="0" w:after="20" w:line="240" w:lineRule="auto"/>
             </w:pPr>
             <w:r>
@@ -41,7 +58,7 @@
                 <w:b/>
                 <w:caps w:val="0"/>
                 <w:color w:val="FFFFFF"/>
-                <w:sz w:val="46"/>
+                <w:sz w:val="48"/>
               </w:rPr>
               <w:t>李振宇</w:t>
             </w:r>
@@ -59,7 +76,7 @@
           <w:p>
             <w:pPr>
               <w:keepNext w:val="0"/>
-              <w:spacing w:before="0" w:after="100" w:line="240" w:lineRule="auto"/>
+              <w:spacing w:before="0" w:after="70" w:line="240" w:lineRule="auto"/>
             </w:pPr>
             <w:r>
               <w:rPr>
@@ -75,6 +92,33 @@
           <w:p>
             <w:pPr>
               <w:keepNext w:val="0"/>
+              <w:spacing w:before="0" w:after="70" w:line="245" w:lineRule="auto"/>
+            </w:pPr>
+            <w:r>
+              <w:rPr>
+                <w:rFonts w:ascii="Microsoft YaHei" w:hAnsi="Microsoft YaHei" w:eastAsia="Microsoft YaHei"/>
+                <w:b w:val="0"/>
+                <w:caps w:val="0"/>
+                <w:color w:val="E3E8E5"/>
+                <w:sz w:val="15"/>
+              </w:rPr>
+              <w:t>从产品定义到工程上线，贯通网站、小程序、业务工具与内容系统。</w:t>
+            </w:r>
+            <w:r>
+              <w:rPr>
+                <w:rFonts w:ascii="Aptos" w:hAnsi="Aptos" w:eastAsia="Microsoft YaHei"/>
+                <w:b w:val="0"/>
+                <w:caps w:val="0"/>
+                <w:color w:val="AEB9B5"/>
+                <w:sz w:val="13"/>
+              </w:rPr>
+              <w:br/>
+              <w:t>From product definition to public delivery across web, Mini Programs, business tools and content systems.</w:t>
+            </w:r>
+          </w:p>
+          <w:p>
+            <w:pPr>
+              <w:keepNext w:val="0"/>
               <w:spacing w:before="0" w:after="0" w:line="240" w:lineRule="auto"/>
             </w:pPr>
             <w:r>
@@ -83,7 +127,7 @@
                 <w:b w:val="0"/>
                 <w:caps w:val="0"/>
                 <w:color w:val="CDD5D2"/>
-                <w:sz w:val="15"/>
+                <w:sz w:val="14"/>
               </w:rPr>
               <w:t xml:space="preserve">成都 CHENGDU  ·  +86 199 8089 3465  ·  </w:t>
             </w:r>
@@ -91,7 +135,7 @@
               <w:r>
                 <w:rPr>
                   <w:color w:val="30E6C8"/>
-                  <w:sz w:val="15"/>
+                  <w:sz w:val="14"/>
                   <w:rFonts w:ascii="Aptos" w:hAnsi="Aptos" w:eastAsia="Microsoft YaHei"/>
                   <w:u w:val="single"/>
                 </w:rPr>
@@ -104,15 +148,15 @@
                 <w:b w:val="0"/>
                 <w:caps w:val="0"/>
                 <w:color w:val="CDD5D2"/>
-                <w:sz w:val="15"/>
+                <w:sz w:val="14"/>
               </w:rPr>
-              <w:t xml:space="preserve">  ·  </w:t>
+              <w:br/>
             </w:r>
             <w:hyperlink r:id="rId12">
               <w:r>
                 <w:rPr>
-                  <w:color w:val="30E6C8"/>
-                  <w:sz w:val="15"/>
+                  <w:color w:val="C8FF37"/>
+                  <w:sz w:val="14"/>
                   <w:rFonts w:ascii="Aptos" w:hAnsi="Aptos" w:eastAsia="Microsoft YaHei"/>
                   <w:u w:val="single"/>
                 </w:rPr>
@@ -125,9 +169,86 @@
                 <w:b w:val="0"/>
                 <w:caps w:val="0"/>
                 <w:color w:val="CDD5D2"/>
-                <w:sz w:val="15"/>
+                <w:sz w:val="14"/>
               </w:rPr>
               <w:t xml:space="preserve">  ·  X @Daycity101</w:t>
+            </w:r>
+          </w:p>
+        </w:tc>
+        <w:tc>
+          <w:tcPr>
+            <w:tcW w:type="dxa" w:w="2126"/>
+            <w:shd w:fill="ECEFED"/>
+            <w:tcMar>
+              <w:top w:w="60" w:type="dxa"/>
+              <w:start w:w="70" w:type="dxa"/>
+              <w:bottom w:w="45" w:type="dxa"/>
+              <w:end w:w="70" w:type="dxa"/>
+            </w:tcMar>
+            <w:tcBorders>
+              <w:bottom w:val="single" w:sz="16" w:color="C8FF37"/>
+              <w:top w:val="single" w:sz="1" w:color="10131A"/>
+              <w:start w:val="single" w:sz="10" w:color="30E6C8"/>
+              <w:end w:val="single" w:sz="1" w:color="10131A"/>
+            </w:tcBorders>
+            <w:vAlign w:val="center"/>
+          </w:tcPr>
+          <w:p>
+            <w:pPr>
+              <w:keepNext w:val="0"/>
+              <w:spacing w:before="0" w:after="20" w:line="240" w:lineRule="auto"/>
+              <w:jc w:val="center"/>
+            </w:pPr>
+            <w:r>
+              <w:drawing>
+                <wp:inline xmlns:a="http://schemas.openxmlformats.org/drawingml/2006/main" xmlns:pic="http://schemas.openxmlformats.org/drawingml/2006/picture">
+                  <wp:extent cx="1108800" cy="1619200"/>
+                  <wp:docPr id="1" name="Picture 1"/>
+                  <wp:cNvGraphicFramePr>
+                    <a:graphicFrameLocks noChangeAspect="1"/>
+                  </wp:cNvGraphicFramePr>
+                  <a:graphic>
+                    <a:graphicData uri="http://schemas.openxmlformats.org/drawingml/2006/picture">
+                      <pic:pic>
+                        <pic:nvPicPr>
+                          <pic:cNvPr id="0" name="微信图片_20260514235744_91_39(1).jpg"/>
+                          <pic:cNvPicPr/>
+                        </pic:nvPicPr>
+                        <pic:blipFill>
+                          <a:blip r:embed="rId13"/>
+                          <a:stretch>
+                            <a:fillRect/>
+                          </a:stretch>
+                        </pic:blipFill>
+                        <pic:spPr>
+                          <a:xfrm>
+                            <a:off x="0" y="0"/>
+                            <a:ext cx="1108800" cy="1619200"/>
+                          </a:xfrm>
+                          <a:prstGeom prst="rect"/>
+                        </pic:spPr>
+                      </pic:pic>
+                    </a:graphicData>
+                  </a:graphic>
+                </wp:inline>
+              </w:drawing>
+            </w:r>
+          </w:p>
+          <w:p>
+            <w:pPr>
+              <w:keepNext w:val="0"/>
+              <w:spacing w:before="0" w:after="0" w:line="240" w:lineRule="auto"/>
+              <w:jc w:val="center"/>
+            </w:pPr>
+            <w:r>
+              <w:rPr>
+                <w:rFonts w:ascii="Aptos" w:hAnsi="Aptos" w:eastAsia="Microsoft YaHei"/>
+                <w:b/>
+                <w:caps/>
+                <w:color w:val="10131A"/>
+                <w:sz w:val="11"/>
+              </w:rPr>
+              <w:t>PROFILE / 01</w:t>
             </w:r>
           </w:p>
         </w:tc>
@@ -729,7 +850,7 @@
               </w:rPr>
               <w:t xml:space="preserve">   </w:t>
             </w:r>
-            <w:hyperlink r:id="rId13">
+            <w:hyperlink r:id="rId14">
               <w:r>
                 <w:rPr>
                   <w:color w:val="30E6C8"/>

</xml_diff>